<commit_message>
docs: Sync ChronoGrid-docs from Google Drive (2026-04-26)
</commit_message>
<xml_diff>
--- a/ChronoGrid-docs/CG-APP-0600_v05.docx
+++ b/ChronoGrid-docs/CG-APP-0600_v05.docx
@@ -19358,1612 +19358,6 @@
         <w:t>ChronoGrid Systems  ·  Kurt, Founder &amp; Lead Architect  ·  Neunkirchen, Niederösterreich  ·  April 2026</w:t>
       </w:r>
     </w:p>
-    <w:p>
-      <w:pPr>
-        <w:spacing w:after="80"/>
-      </w:pPr>
-    </w:p>
-    <w:p>
-      <w:pPr>
-        <w:spacing w:after="80"/>
-      </w:pPr>
-    </w:p>
-    <w:p>
-      <w:pPr>
-        <w:pStyle w:val="Heading2"/>
-      </w:pPr>
-      <w:r>
-        <w:rPr>
-          <w:b/>
-          <w:color w:val="17A589"/>
-          <w:sz w:val="22"/>
-          <w:szCs w:val="22"/>
-        </w:rPr>
-        <w:t>UC6 — NIS2 Audit Log</w:t>
-      </w:r>
-    </w:p>
-    <w:p>
-      <w:pPr>
-        <w:spacing w:after="80"/>
-      </w:pPr>
-    </w:p>
-    <w:tbl>
-      <w:tblPr>
-        <w:tblW w:w="9026" w:type="dxa"/>
-      </w:tblPr>
-      <w:tblGrid>
-        <w:gridCol w:w="2400"/>
-        <w:gridCol w:w="6626"/>
-      </w:tblGrid>
-      <w:tr>
-        <w:tc>
-          <w:tcPr>
-            <w:tcW w:w="2400" w:type="dxa"/>
-            <w:tcBorders>
-              <w:top w:val="single" w:sz="1" w:color="C8D8E8"/>
-              <w:left w:val="single" w:sz="1" w:color="C8D8E8"/>
-              <w:bottom w:val="single" w:sz="1" w:color="C8D8E8"/>
-              <w:right w:val="single" w:sz="1" w:color="C8D8E8"/>
-            </w:tcBorders>
-            <w:shd w:val="clear" w:color="auto" w:fill="F2F4F7"/>
-            <w:tcMar>
-              <w:top w:w="80" w:type="dxa"/>
-              <w:left w:w="120" w:type="dxa"/>
-              <w:bottom w:w="80" w:type="dxa"/>
-              <w:right w:w="120" w:type="dxa"/>
-            </w:tcMar>
-          </w:tcPr>
-          <w:p>
-            <w:r>
-              <w:rPr>
-                <w:b/>
-                <w:color w:val="1A1A1A"/>
-                <w:sz w:val="17"/>
-                <w:szCs w:val="17"/>
-              </w:rPr>
-              <w:t>Domäne</w:t>
-            </w:r>
-          </w:p>
-        </w:tc>
-        <w:tc>
-          <w:tcPr>
-            <w:tcW w:w="6626" w:type="dxa"/>
-            <w:tcBorders>
-              <w:top w:val="single" w:sz="1" w:color="C8D8E8"/>
-              <w:left w:val="single" w:sz="1" w:color="C8D8E8"/>
-              <w:bottom w:val="single" w:sz="1" w:color="C8D8E8"/>
-              <w:right w:val="single" w:sz="1" w:color="C8D8E8"/>
-            </w:tcBorders>
-            <w:shd w:val="clear" w:color="auto" w:fill="FFFFFF"/>
-            <w:tcMar>
-              <w:top w:w="80" w:type="dxa"/>
-              <w:left w:w="120" w:type="dxa"/>
-              <w:bottom w:w="80" w:type="dxa"/>
-              <w:right w:w="120" w:type="dxa"/>
-            </w:tcMar>
-          </w:tcPr>
-          <w:p>
-            <w:r>
-              <w:rPr>
-                <w:color w:val="1A1A1A"/>
-                <w:sz w:val="17"/>
-                <w:szCs w:val="17"/>
-              </w:rPr>
-              <w:t>urn:cgns:audit:nis2-incident:v1  (TAI-linear, Granularität: Nanosekunde)</w:t>
-            </w:r>
-          </w:p>
-        </w:tc>
-      </w:tr>
-      <w:tr>
-        <w:tc>
-          <w:tcPr>
-            <w:tcW w:w="2400" w:type="dxa"/>
-            <w:tcBorders>
-              <w:top w:val="single" w:sz="1" w:color="C8D8E8"/>
-              <w:left w:val="single" w:sz="1" w:color="C8D8E8"/>
-              <w:bottom w:val="single" w:sz="1" w:color="C8D8E8"/>
-              <w:right w:val="single" w:sz="1" w:color="C8D8E8"/>
-            </w:tcBorders>
-            <w:shd w:val="clear" w:color="auto" w:fill="F2F4F7"/>
-            <w:tcMar>
-              <w:top w:w="80" w:type="dxa"/>
-              <w:left w:w="120" w:type="dxa"/>
-              <w:bottom w:w="80" w:type="dxa"/>
-              <w:right w:w="120" w:type="dxa"/>
-            </w:tcMar>
-          </w:tcPr>
-          <w:p>
-            <w:r>
-              <w:rPr>
-                <w:b/>
-                <w:color w:val="1A1A1A"/>
-                <w:sz w:val="17"/>
-                <w:szCs w:val="17"/>
-              </w:rPr>
-              <w:t>Akteure</w:t>
-            </w:r>
-          </w:p>
-        </w:tc>
-        <w:tc>
-          <w:tcPr>
-            <w:tcW w:w="6626" w:type="dxa"/>
-            <w:tcBorders>
-              <w:top w:val="single" w:sz="1" w:color="C8D8E8"/>
-              <w:left w:val="single" w:sz="1" w:color="C8D8E8"/>
-              <w:bottom w:val="single" w:sz="1" w:color="C8D8E8"/>
-              <w:right w:val="single" w:sz="1" w:color="C8D8E8"/>
-            </w:tcBorders>
-            <w:shd w:val="clear" w:color="auto" w:fill="FFFFFF"/>
-            <w:tcMar>
-              <w:top w:w="80" w:type="dxa"/>
-              <w:left w:w="120" w:type="dxa"/>
-              <w:bottom w:w="80" w:type="dxa"/>
-              <w:right w:w="120" w:type="dxa"/>
-            </w:tcMar>
-          </w:tcPr>
-          <w:p>
-            <w:r>
-              <w:rPr>
-                <w:color w:val="1A1A1A"/>
-                <w:sz w:val="17"/>
-                <w:szCs w:val="17"/>
-              </w:rPr>
-              <w:t>SIEM-System, ChronoGrid Engine, Audit-Speicher (WORM/CGFS-3)</w:t>
-            </w:r>
-          </w:p>
-        </w:tc>
-      </w:tr>
-      <w:tr>
-        <w:tc>
-          <w:tcPr>
-            <w:tcW w:w="2400" w:type="dxa"/>
-            <w:tcBorders>
-              <w:top w:val="single" w:sz="1" w:color="C8D8E8"/>
-              <w:left w:val="single" w:sz="1" w:color="C8D8E8"/>
-              <w:bottom w:val="single" w:sz="1" w:color="C8D8E8"/>
-              <w:right w:val="single" w:sz="1" w:color="C8D8E8"/>
-            </w:tcBorders>
-            <w:shd w:val="clear" w:color="auto" w:fill="F2F4F7"/>
-            <w:tcMar>
-              <w:top w:w="80" w:type="dxa"/>
-              <w:left w:w="120" w:type="dxa"/>
-              <w:bottom w:w="80" w:type="dxa"/>
-              <w:right w:w="120" w:type="dxa"/>
-            </w:tcMar>
-          </w:tcPr>
-          <w:p>
-            <w:r>
-              <w:rPr>
-                <w:b/>
-                <w:color w:val="1A1A1A"/>
-                <w:sz w:val="17"/>
-                <w:szCs w:val="17"/>
-              </w:rPr>
-              <w:t>Regulierung</w:t>
-            </w:r>
-          </w:p>
-        </w:tc>
-        <w:tc>
-          <w:tcPr>
-            <w:tcW w:w="6626" w:type="dxa"/>
-            <w:tcBorders>
-              <w:top w:val="single" w:sz="1" w:color="C8D8E8"/>
-              <w:left w:val="single" w:sz="1" w:color="C8D8E8"/>
-              <w:bottom w:val="single" w:sz="1" w:color="C8D8E8"/>
-              <w:right w:val="single" w:sz="1" w:color="C8D8E8"/>
-            </w:tcBorders>
-            <w:shd w:val="clear" w:color="auto" w:fill="FFFFFF"/>
-            <w:tcMar>
-              <w:top w:w="80" w:type="dxa"/>
-              <w:left w:w="120" w:type="dxa"/>
-              <w:bottom w:w="80" w:type="dxa"/>
-              <w:right w:w="120" w:type="dxa"/>
-            </w:tcMar>
-          </w:tcPr>
-          <w:p>
-            <w:r>
-              <w:rPr>
-                <w:color w:val="1A1A1A"/>
-                <w:sz w:val="17"/>
-                <w:szCs w:val="17"/>
-              </w:rPr>
-              <w:t>NIS2 EU 2022/2555 — Art. 21 Abs. 2, Art. 23 (Frühwarnung 24 h), Art. 32/33</w:t>
-            </w:r>
-          </w:p>
-        </w:tc>
-      </w:tr>
-      <w:tr>
-        <w:tc>
-          <w:tcPr>
-            <w:tcW w:w="2400" w:type="dxa"/>
-            <w:tcBorders>
-              <w:top w:val="single" w:sz="1" w:color="C8D8E8"/>
-              <w:left w:val="single" w:sz="1" w:color="C8D8E8"/>
-              <w:bottom w:val="single" w:sz="1" w:color="C8D8E8"/>
-              <w:right w:val="single" w:sz="1" w:color="C8D8E8"/>
-            </w:tcBorders>
-            <w:shd w:val="clear" w:color="auto" w:fill="F2F4F7"/>
-            <w:tcMar>
-              <w:top w:w="80" w:type="dxa"/>
-              <w:left w:w="120" w:type="dxa"/>
-              <w:bottom w:w="80" w:type="dxa"/>
-              <w:right w:w="120" w:type="dxa"/>
-            </w:tcMar>
-          </w:tcPr>
-          <w:p>
-            <w:r>
-              <w:rPr>
-                <w:b/>
-                <w:color w:val="1A1A1A"/>
-                <w:sz w:val="17"/>
-                <w:szCs w:val="17"/>
-              </w:rPr>
-              <w:t>Konformität</w:t>
-            </w:r>
-          </w:p>
-        </w:tc>
-        <w:tc>
-          <w:tcPr>
-            <w:tcW w:w="6626" w:type="dxa"/>
-            <w:tcBorders>
-              <w:top w:val="single" w:sz="1" w:color="C8D8E8"/>
-              <w:left w:val="single" w:sz="1" w:color="C8D8E8"/>
-              <w:bottom w:val="single" w:sz="1" w:color="C8D8E8"/>
-              <w:right w:val="single" w:sz="1" w:color="C8D8E8"/>
-            </w:tcBorders>
-            <w:shd w:val="clear" w:color="auto" w:fill="FFFFFF"/>
-            <w:tcMar>
-              <w:top w:w="80" w:type="dxa"/>
-              <w:left w:w="120" w:type="dxa"/>
-              <w:bottom w:w="80" w:type="dxa"/>
-              <w:right w:w="120" w:type="dxa"/>
-            </w:tcMar>
-          </w:tcPr>
-          <w:p>
-            <w:r>
-              <w:rPr>
-                <w:color w:val="1A1A1A"/>
-                <w:sz w:val="17"/>
-                <w:szCs w:val="17"/>
-              </w:rPr>
-              <w:t>Level 2 (CGTA, REST, JWT/RBAC) + CGFS-3 (WORM, OAIS)</w:t>
-            </w:r>
-          </w:p>
-        </w:tc>
-      </w:tr>
-      <w:tr>
-        <w:tc>
-          <w:tcPr>
-            <w:tcW w:w="2400" w:type="dxa"/>
-            <w:tcBorders>
-              <w:top w:val="single" w:sz="1" w:color="C8D8E8"/>
-              <w:left w:val="single" w:sz="1" w:color="C8D8E8"/>
-              <w:bottom w:val="single" w:sz="1" w:color="C8D8E8"/>
-              <w:right w:val="single" w:sz="1" w:color="C8D8E8"/>
-            </w:tcBorders>
-            <w:shd w:val="clear" w:color="auto" w:fill="F2F4F7"/>
-            <w:tcMar>
-              <w:top w:w="80" w:type="dxa"/>
-              <w:left w:w="120" w:type="dxa"/>
-              <w:bottom w:w="80" w:type="dxa"/>
-              <w:right w:w="120" w:type="dxa"/>
-            </w:tcMar>
-          </w:tcPr>
-          <w:p>
-            <w:r>
-              <w:rPr>
-                <w:b/>
-                <w:color w:val="1A1A1A"/>
-                <w:sz w:val="17"/>
-                <w:szCs w:val="17"/>
-              </w:rPr>
-              <w:t>Trigger</w:t>
-            </w:r>
-          </w:p>
-        </w:tc>
-        <w:tc>
-          <w:tcPr>
-            <w:tcW w:w="6626" w:type="dxa"/>
-            <w:tcBorders>
-              <w:top w:val="single" w:sz="1" w:color="C8D8E8"/>
-              <w:left w:val="single" w:sz="1" w:color="C8D8E8"/>
-              <w:bottom w:val="single" w:sz="1" w:color="C8D8E8"/>
-              <w:right w:val="single" w:sz="1" w:color="C8D8E8"/>
-            </w:tcBorders>
-            <w:shd w:val="clear" w:color="auto" w:fill="FFFFFF"/>
-            <w:tcMar>
-              <w:top w:w="80" w:type="dxa"/>
-              <w:left w:w="120" w:type="dxa"/>
-              <w:bottom w:w="80" w:type="dxa"/>
-              <w:right w:w="120" w:type="dxa"/>
-            </w:tcMar>
-          </w:tcPr>
-          <w:p>
-            <w:r>
-              <w:rPr>
-                <w:color w:val="1A1A1A"/>
-                <w:sz w:val="17"/>
-                <w:szCs w:val="17"/>
-              </w:rPr>
-              <w:t>SIEM-System erkennt Sicherheitsvorfall</w:t>
-            </w:r>
-          </w:p>
-        </w:tc>
-      </w:tr>
-      <w:tr>
-        <w:tc>
-          <w:tcPr>
-            <w:tcW w:w="2400" w:type="dxa"/>
-            <w:tcBorders>
-              <w:top w:val="single" w:sz="1" w:color="C8D8E8"/>
-              <w:left w:val="single" w:sz="1" w:color="C8D8E8"/>
-              <w:bottom w:val="single" w:sz="1" w:color="C8D8E8"/>
-              <w:right w:val="single" w:sz="1" w:color="C8D8E8"/>
-            </w:tcBorders>
-            <w:shd w:val="clear" w:color="auto" w:fill="F2F4F7"/>
-            <w:tcMar>
-              <w:top w:w="80" w:type="dxa"/>
-              <w:left w:w="120" w:type="dxa"/>
-              <w:bottom w:w="80" w:type="dxa"/>
-              <w:right w:w="120" w:type="dxa"/>
-            </w:tcMar>
-          </w:tcPr>
-          <w:p>
-            <w:r>
-              <w:rPr>
-                <w:b/>
-                <w:color w:val="1A1A1A"/>
-                <w:sz w:val="17"/>
-                <w:szCs w:val="17"/>
-              </w:rPr>
-              <w:t>Referenz</w:t>
-            </w:r>
-          </w:p>
-        </w:tc>
-        <w:tc>
-          <w:tcPr>
-            <w:tcW w:w="6626" w:type="dxa"/>
-            <w:tcBorders>
-              <w:top w:val="single" w:sz="1" w:color="C8D8E8"/>
-              <w:left w:val="single" w:sz="1" w:color="C8D8E8"/>
-              <w:bottom w:val="single" w:sz="1" w:color="C8D8E8"/>
-              <w:right w:val="single" w:sz="1" w:color="C8D8E8"/>
-            </w:tcBorders>
-            <w:shd w:val="clear" w:color="auto" w:fill="FFFFFF"/>
-            <w:tcMar>
-              <w:top w:w="80" w:type="dxa"/>
-              <w:left w:w="120" w:type="dxa"/>
-              <w:bottom w:w="80" w:type="dxa"/>
-              <w:right w:w="120" w:type="dxa"/>
-            </w:tcMar>
-          </w:tcPr>
-          <w:p>
-            <w:r>
-              <w:rPr>
-                <w:color w:val="1A1A1A"/>
-                <w:sz w:val="17"/>
-                <w:szCs w:val="17"/>
-              </w:rPr>
-              <w:t>Detailliertes Anwendungsprofil: CG-APP-0900 „NIS2 Compliance Profile“</w:t>
-            </w:r>
-          </w:p>
-        </w:tc>
-      </w:tr>
-    </w:tbl>
-    <w:p>
-      <w:pPr>
-        <w:spacing w:after="80"/>
-      </w:pPr>
-    </w:p>
-    <w:p>
-      <w:pPr>
-        <w:pStyle w:val="Heading3"/>
-      </w:pPr>
-      <w:r>
-        <w:rPr>
-          <w:b/>
-          <w:color w:val="1B3A6B"/>
-          <w:sz w:val="19"/>
-          <w:szCs w:val="19"/>
-        </w:rPr>
-        <w:t>6.1  Kerneigenschaft</w:t>
-      </w:r>
-    </w:p>
-    <w:p>
-      <w:pPr>
-        <w:spacing w:after="120" w:line="276"/>
-      </w:pPr>
-      <w:r>
-        <w:rPr>
-          <w:color w:val="1A1A1A"/>
-          <w:sz w:val="18"/>
-          <w:szCs w:val="18"/>
-        </w:rPr>
-        <w:t xml:space="preserve">ChronoGrid-konforme Audit-Logs sind strukturell unverfälschbar: </w:t>
-      </w:r>
-      <w:r>
-        <w:rPr>
-          <w:b/>
-          <w:bCs/>
-          <w:color w:val="1A1A1A"/>
-          <w:sz w:val="18"/>
-          <w:szCs w:val="18"/>
-        </w:rPr>
-        <w:t xml:space="preserve">I-S1</w:t>
-      </w:r>
-      <w:r>
-        <w:rPr>
-          <w:color w:val="1A1A1A"/>
-          <w:sz w:val="18"/>
-          <w:szCs w:val="18"/>
-        </w:rPr>
-        <w:t xml:space="preserve"> (Th. 5.3) verbietet UPDATE/DELETE. </w:t>
-      </w:r>
-      <w:r>
-        <w:rPr>
-          <w:b/>
-          <w:bCs/>
-          <w:color w:val="1A1A1A"/>
-          <w:sz w:val="18"/>
-          <w:szCs w:val="18"/>
-        </w:rPr>
-        <w:t xml:space="preserve">CGFI</w:t>
-      </w:r>
-      <w:r>
-        <w:rPr>
-          <w:color w:val="1A1A1A"/>
-          <w:sz w:val="18"/>
-          <w:szCs w:val="18"/>
-        </w:rPr>
-        <w:t xml:space="preserve"> (SHA-256) macht Änderungen erkennbar. </w:t>
-      </w:r>
-      <w:r>
-        <w:rPr>
-          <w:b/>
-          <w:bCs/>
-          <w:color w:val="1A1A1A"/>
-          <w:sz w:val="18"/>
-          <w:szCs w:val="18"/>
-        </w:rPr>
-        <w:t xml:space="preserve">WORM</w:t>
-      </w:r>
-      <w:r>
-        <w:rPr>
-          <w:color w:val="1A1A1A"/>
-          <w:sz w:val="18"/>
-          <w:szCs w:val="18"/>
-        </w:rPr>
-        <w:t xml:space="preserve"> macht sie physisch unmöglich. Das ist keine Policy — das ist Systemstruktur.</w:t>
-      </w:r>
-    </w:p>
-    <w:p>
-      <w:pPr>
-        <w:spacing w:after="80"/>
-      </w:pPr>
-    </w:p>
-    <w:p>
-      <w:pPr>
-        <w:pStyle w:val="Heading3"/>
-      </w:pPr>
-      <w:r>
-        <w:rPr>
-          <w:b/>
-          <w:color w:val="1B3A6B"/>
-          <w:sz w:val="19"/>
-          <w:szCs w:val="19"/>
-        </w:rPr>
-        <w:t>6.2  Ablauf</w:t>
-      </w:r>
-    </w:p>
-    <w:p>
-      <w:pPr>
-        <w:spacing w:after="80"/>
-        <w:ind w:left="360" w:hanging="180"/>
-      </w:pPr>
-      <w:r>
-        <w:rPr>
-          <w:color w:val="1A1A1A"/>
-          <w:sz w:val="18"/>
-          <w:szCs w:val="18"/>
-        </w:rPr>
-        <w:t xml:space="preserve">•  SIEM-System erkennt Anomalie und erzeugt Ereignisdatensatz (JSON, Schema nis2-incident/v1).</w:t>
-      </w:r>
-    </w:p>
-    <w:p>
-      <w:pPr>
-        <w:spacing w:after="80"/>
-        <w:ind w:left="360" w:hanging="180"/>
-      </w:pPr>
-      <w:r>
-        <w:rPr>
-          <w:color w:val="1A1A1A"/>
-          <w:sz w:val="18"/>
-          <w:szCs w:val="18"/>
-        </w:rPr>
-        <w:t xml:space="preserve">•  ChronoGrid Engine erzeugt CGTA: CG:nis2-incident:1742041937847293012/v1 (TAI-Nanosekunden).</w:t>
-      </w:r>
-    </w:p>
-    <w:p>
-      <w:pPr>
-        <w:spacing w:after="80"/>
-        <w:ind w:left="360" w:hanging="180"/>
-      </w:pPr>
-      <w:r>
-        <w:rPr>
-          <w:color w:val="1A1A1A"/>
-          <w:sz w:val="18"/>
-          <w:szCs w:val="18"/>
-        </w:rPr>
-        <w:t xml:space="preserve">•  CGFI = SHA-256(TAI-CGTA ‖ SHA-256(JSON) ‖ urn:cgns:filetype:audit-event:v1).</w:t>
-      </w:r>
-    </w:p>
-    <w:p>
-      <w:pPr>
-        <w:spacing w:after="80"/>
-        <w:ind w:left="360" w:hanging="180"/>
-      </w:pPr>
-      <w:r>
-        <w:rPr>
-          <w:color w:val="1A1A1A"/>
-          <w:sz w:val="18"/>
-          <w:szCs w:val="18"/>
-        </w:rPr>
-        <w:t xml:space="preserve">•  Eintrag in WORM (CGFS-3). I-S1 verhindert jede spätere Mutation; CG-E-009 bei Versuch.</w:t>
-      </w:r>
-    </w:p>
-    <w:p>
-      <w:pPr>
-        <w:spacing w:after="80"/>
-        <w:ind w:left="360" w:hanging="180"/>
-      </w:pPr>
-      <w:r>
-        <w:rPr>
-          <w:color w:val="1A1A1A"/>
-          <w:sz w:val="18"/>
-          <w:szCs w:val="18"/>
-        </w:rPr>
-        <w:t xml:space="preserve">•  Art. 23-Meldung: CGTA + CGFI als maschinenlesbare Nachweise an Behörde.</w:t>
-      </w:r>
-    </w:p>
-    <w:p>
-      <w:pPr>
-        <w:spacing w:after="80"/>
-      </w:pPr>
-    </w:p>
-    <w:p>
-      <w:pPr>
-        <w:pStyle w:val="Heading3"/>
-      </w:pPr>
-      <w:r>
-        <w:rPr>
-          <w:b/>
-          <w:color w:val="1B3A6B"/>
-          <w:sz w:val="19"/>
-          <w:szCs w:val="19"/>
-        </w:rPr>
-        <w:t>6.3  CGTA/CGFI-Beispiel</w:t>
-      </w:r>
-    </w:p>
-    <w:tbl>
-      <w:tblPr>
-        <w:tblW w:w="9026" w:type="dxa"/>
-      </w:tblPr>
-      <w:tblGrid>
-        <w:gridCol w:w="9026"/>
-      </w:tblGrid>
-      <w:tr>
-        <w:tc>
-          <w:tcPr>
-            <w:tcW w:w="9026" w:type="dxa"/>
-            <w:tcBorders>
-              <w:top w:val="single" w:sz="4" w:color="2C3E50"/>
-              <w:left w:val="single" w:sz="4" w:color="2C3E50"/>
-              <w:bottom w:val="single" w:sz="4" w:color="2C3E50"/>
-              <w:right w:val="single" w:sz="4" w:color="2C3E50"/>
-            </w:tcBorders>
-            <w:shd w:val="clear" w:color="auto" w:fill="F8F9FA"/>
-            <w:tcMar>
-              <w:top w:w="120" w:type="dxa"/>
-              <w:left w:w="180" w:type="dxa"/>
-              <w:bottom w:w="120" w:type="dxa"/>
-              <w:right w:w="180" w:type="dxa"/>
-            </w:tcMar>
-          </w:tcPr>
-          <w:p>
-            <w:pPr>
-              <w:spacing w:after="40"/>
-            </w:pPr>
-            <w:r>
-              <w:rPr>
-                <w:rFonts w:ascii="Courier New" w:hAnsi="Courier New"/>
-                <w:color w:val="2C3E50"/>
-                <w:sz w:val="16"/>
-                <w:szCs w:val="16"/>
-              </w:rPr>
-              <w:t xml:space="preserve">// NIS2-Vorfall: unautorisierter SSH-Login</w:t>
-            </w:r>
-          </w:p>
-          <w:p>
-            <w:pPr>
-              <w:spacing w:after="40"/>
-            </w:pPr>
-            <w:r>
-              <w:rPr>
-                <w:rFonts w:ascii="Courier New" w:hAnsi="Courier New"/>
-                <w:color w:val="2C3E50"/>
-                <w:sz w:val="16"/>
-                <w:szCs w:val="16"/>
-              </w:rPr>
-              <w:t xml:space="preserve">CGTA : CG:nis2-incident:1742041937847293012/v1</w:t>
-            </w:r>
-          </w:p>
-          <w:p>
-            <w:pPr>
-              <w:spacing w:after="40"/>
-            </w:pPr>
-            <w:r>
-              <w:rPr>
-                <w:rFonts w:ascii="Courier New" w:hAnsi="Courier New"/>
-                <w:color w:val="2C3E50"/>
-                <w:sz w:val="16"/>
-                <w:szCs w:val="16"/>
-              </w:rPr>
-              <w:t xml:space="preserve">CGFI : SHA-256(CGTA || SHA-256(payload) || "urn:cgns:filetype:audit-event:v1")</w:t>
-            </w:r>
-          </w:p>
-          <w:p>
-            <w:pPr>
-              <w:spacing w:after="40"/>
-            </w:pPr>
-            <w:r>
-              <w:rPr>
-                <w:rFonts w:ascii="Courier New" w:hAnsi="Courier New"/>
-                <w:color w:val="2C3E50"/>
-                <w:sz w:val="16"/>
-                <w:szCs w:val="16"/>
-              </w:rPr>
-              <w:t xml:space="preserve"/>
-            </w:r>
-          </w:p>
-          <w:p>
-            <w:pPr>
-              <w:spacing w:after="40"/>
-            </w:pPr>
-            <w:r>
-              <w:rPr>
-                <w:rFonts w:ascii="Courier New" w:hAnsi="Courier New"/>
-                <w:color w:val="2C3E50"/>
-                <w:sz w:val="16"/>
-                <w:szCs w:val="16"/>
-              </w:rPr>
-              <w:t xml:space="preserve">// Art. 23 Meldung (binnen 24 h):</w:t>
-            </w:r>
-          </w:p>
-          <w:p>
-            <w:pPr>
-              <w:spacing w:after="40"/>
-            </w:pPr>
-            <w:r>
-              <w:rPr>
-                <w:rFonts w:ascii="Courier New" w:hAnsi="Courier New"/>
-                <w:color w:val="2C3E50"/>
-                <w:sz w:val="16"/>
-                <w:szCs w:val="16"/>
-              </w:rPr>
-              <w:t xml:space="preserve">{</w:t>
-            </w:r>
-          </w:p>
-          <w:p>
-            <w:pPr>
-              <w:spacing w:after="40"/>
-            </w:pPr>
-            <w:r>
-              <w:rPr>
-                <w:rFonts w:ascii="Courier New" w:hAnsi="Courier New"/>
-                <w:color w:val="2C3E50"/>
-                <w:sz w:val="16"/>
-                <w:szCs w:val="16"/>
-              </w:rPr>
-              <w:t xml:space="preserve">  "incident_id": "CGFI:a3f7b2c1...",</w:t>
-            </w:r>
-          </w:p>
-          <w:p>
-            <w:pPr>
-              <w:spacing w:after="40"/>
-            </w:pPr>
-            <w:r>
-              <w:rPr>
-                <w:rFonts w:ascii="Courier New" w:hAnsi="Courier New"/>
-                <w:color w:val="2C3E50"/>
-                <w:sz w:val="16"/>
-                <w:szCs w:val="16"/>
-              </w:rPr>
-              <w:t xml:space="preserve">  "detected_at":  "CG:nis2-incident:1742041937847293012/v1",</w:t>
-            </w:r>
-          </w:p>
-          <w:p>
-            <w:pPr>
-              <w:spacing w:after="40"/>
-            </w:pPr>
-            <w:r>
-              <w:rPr>
-                <w:rFonts w:ascii="Courier New" w:hAnsi="Courier New"/>
-                <w:color w:val="2C3E50"/>
-                <w:sz w:val="16"/>
-                <w:szCs w:val="16"/>
-              </w:rPr>
-              <w:t xml:space="preserve">  "detected_at_iso": "2025-03-15T14:32:17.847Z",</w:t>
-            </w:r>
-          </w:p>
-          <w:p>
-            <w:pPr>
-              <w:spacing w:after="40"/>
-            </w:pPr>
-            <w:r>
-              <w:rPr>
-                <w:rFonts w:ascii="Courier New" w:hAnsi="Courier New"/>
-                <w:color w:val="2C3E50"/>
-                <w:sz w:val="16"/>
-                <w:szCs w:val="16"/>
-              </w:rPr>
-              <w:t xml:space="preserve">  "integrity": { "algorithm": "SHA-256", "cgfi": "a3f7b2c1..." }</w:t>
-            </w:r>
-          </w:p>
-          <w:p>
-            <w:pPr>
-              <w:spacing w:after="40"/>
-            </w:pPr>
-            <w:r>
-              <w:rPr>
-                <w:rFonts w:ascii="Courier New" w:hAnsi="Courier New"/>
-                <w:color w:val="2C3E50"/>
-                <w:sz w:val="16"/>
-                <w:szCs w:val="16"/>
-              </w:rPr>
-              <w:t xml:space="preserve">}</w:t>
-            </w:r>
-          </w:p>
-        </w:tc>
-      </w:tr>
-    </w:tbl>
-    <w:p>
-      <w:pPr>
-        <w:spacing w:after="80"/>
-      </w:pPr>
-    </w:p>
-    <w:p>
-      <w:pPr>
-        <w:spacing w:after="80"/>
-      </w:pPr>
-    </w:p>
-    <w:p>
-      <w:pPr>
-        <w:pStyle w:val="Heading2"/>
-      </w:pPr>
-      <w:r>
-        <w:rPr>
-          <w:b/>
-          <w:color w:val="17A589"/>
-          <w:sz w:val="22"/>
-          <w:szCs w:val="22"/>
-        </w:rPr>
-        <w:t>UC7 — CRA Build Pipeline / SBOM-Timestamp</w:t>
-      </w:r>
-    </w:p>
-    <w:p>
-      <w:pPr>
-        <w:spacing w:after="80"/>
-      </w:pPr>
-    </w:p>
-    <w:tbl>
-      <w:tblPr>
-        <w:tblW w:w="9026" w:type="dxa"/>
-      </w:tblPr>
-      <w:tblGrid>
-        <w:gridCol w:w="2400"/>
-        <w:gridCol w:w="6626"/>
-      </w:tblGrid>
-      <w:tr>
-        <w:tc>
-          <w:tcPr>
-            <w:tcW w:w="2400" w:type="dxa"/>
-            <w:tcBorders>
-              <w:top w:val="single" w:sz="1" w:color="C8D8E8"/>
-              <w:left w:val="single" w:sz="1" w:color="C8D8E8"/>
-              <w:bottom w:val="single" w:sz="1" w:color="C8D8E8"/>
-              <w:right w:val="single" w:sz="1" w:color="C8D8E8"/>
-            </w:tcBorders>
-            <w:shd w:val="clear" w:color="auto" w:fill="F2F4F7"/>
-            <w:tcMar>
-              <w:top w:w="80" w:type="dxa"/>
-              <w:left w:w="120" w:type="dxa"/>
-              <w:bottom w:w="80" w:type="dxa"/>
-              <w:right w:w="120" w:type="dxa"/>
-            </w:tcMar>
-          </w:tcPr>
-          <w:p>
-            <w:r>
-              <w:rPr>
-                <w:b/>
-                <w:color w:val="1A1A1A"/>
-                <w:sz w:val="17"/>
-                <w:szCs w:val="17"/>
-              </w:rPr>
-              <w:t>Domäne</w:t>
-            </w:r>
-          </w:p>
-        </w:tc>
-        <w:tc>
-          <w:tcPr>
-            <w:tcW w:w="6626" w:type="dxa"/>
-            <w:tcBorders>
-              <w:top w:val="single" w:sz="1" w:color="C8D8E8"/>
-              <w:left w:val="single" w:sz="1" w:color="C8D8E8"/>
-              <w:bottom w:val="single" w:sz="1" w:color="C8D8E8"/>
-              <w:right w:val="single" w:sz="1" w:color="C8D8E8"/>
-            </w:tcBorders>
-            <w:shd w:val="clear" w:color="auto" w:fill="FFFFFF"/>
-            <w:tcMar>
-              <w:top w:w="80" w:type="dxa"/>
-              <w:left w:w="120" w:type="dxa"/>
-              <w:bottom w:w="80" w:type="dxa"/>
-              <w:right w:w="120" w:type="dxa"/>
-            </w:tcMar>
-          </w:tcPr>
-          <w:p>
-            <w:r>
-              <w:rPr>
-                <w:color w:val="1A1A1A"/>
-                <w:sz w:val="17"/>
-                <w:szCs w:val="17"/>
-              </w:rPr>
-              <w:t>urn:cgns:audit:build-sbom:v1  (TAI-linear, Granularität: Nanosekunde)</w:t>
-            </w:r>
-          </w:p>
-        </w:tc>
-      </w:tr>
-      <w:tr>
-        <w:tc>
-          <w:tcPr>
-            <w:tcW w:w="2400" w:type="dxa"/>
-            <w:tcBorders>
-              <w:top w:val="single" w:sz="1" w:color="C8D8E8"/>
-              <w:left w:val="single" w:sz="1" w:color="C8D8E8"/>
-              <w:bottom w:val="single" w:sz="1" w:color="C8D8E8"/>
-              <w:right w:val="single" w:sz="1" w:color="C8D8E8"/>
-            </w:tcBorders>
-            <w:shd w:val="clear" w:color="auto" w:fill="F2F4F7"/>
-            <w:tcMar>
-              <w:top w:w="80" w:type="dxa"/>
-              <w:left w:w="120" w:type="dxa"/>
-              <w:bottom w:w="80" w:type="dxa"/>
-              <w:right w:w="120" w:type="dxa"/>
-            </w:tcMar>
-          </w:tcPr>
-          <w:p>
-            <w:r>
-              <w:rPr>
-                <w:b/>
-                <w:color w:val="1A1A1A"/>
-                <w:sz w:val="17"/>
-                <w:szCs w:val="17"/>
-              </w:rPr>
-              <w:t>Akteure</w:t>
-            </w:r>
-          </w:p>
-        </w:tc>
-        <w:tc>
-          <w:tcPr>
-            <w:tcW w:w="6626" w:type="dxa"/>
-            <w:tcBorders>
-              <w:top w:val="single" w:sz="1" w:color="C8D8E8"/>
-              <w:left w:val="single" w:sz="1" w:color="C8D8E8"/>
-              <w:bottom w:val="single" w:sz="1" w:color="C8D8E8"/>
-              <w:right w:val="single" w:sz="1" w:color="C8D8E8"/>
-            </w:tcBorders>
-            <w:shd w:val="clear" w:color="auto" w:fill="FFFFFF"/>
-            <w:tcMar>
-              <w:top w:w="80" w:type="dxa"/>
-              <w:left w:w="120" w:type="dxa"/>
-              <w:bottom w:w="80" w:type="dxa"/>
-              <w:right w:w="120" w:type="dxa"/>
-            </w:tcMar>
-          </w:tcPr>
-          <w:p>
-            <w:r>
-              <w:rPr>
-                <w:color w:val="1A1A1A"/>
-                <w:sz w:val="17"/>
-                <w:szCs w:val="17"/>
-              </w:rPr>
-              <w:t>CI/CD-System (GitHub Actions, GitLab CI), ChronoGrid Engine, SBOM-Store</w:t>
-            </w:r>
-          </w:p>
-        </w:tc>
-      </w:tr>
-      <w:tr>
-        <w:tc>
-          <w:tcPr>
-            <w:tcW w:w="2400" w:type="dxa"/>
-            <w:tcBorders>
-              <w:top w:val="single" w:sz="1" w:color="C8D8E8"/>
-              <w:left w:val="single" w:sz="1" w:color="C8D8E8"/>
-              <w:bottom w:val="single" w:sz="1" w:color="C8D8E8"/>
-              <w:right w:val="single" w:sz="1" w:color="C8D8E8"/>
-            </w:tcBorders>
-            <w:shd w:val="clear" w:color="auto" w:fill="F2F4F7"/>
-            <w:tcMar>
-              <w:top w:w="80" w:type="dxa"/>
-              <w:left w:w="120" w:type="dxa"/>
-              <w:bottom w:w="80" w:type="dxa"/>
-              <w:right w:w="120" w:type="dxa"/>
-            </w:tcMar>
-          </w:tcPr>
-          <w:p>
-            <w:r>
-              <w:rPr>
-                <w:b/>
-                <w:color w:val="1A1A1A"/>
-                <w:sz w:val="17"/>
-                <w:szCs w:val="17"/>
-              </w:rPr>
-              <w:t>Regulierung</w:t>
-            </w:r>
-          </w:p>
-        </w:tc>
-        <w:tc>
-          <w:tcPr>
-            <w:tcW w:w="6626" w:type="dxa"/>
-            <w:tcBorders>
-              <w:top w:val="single" w:sz="1" w:color="C8D8E8"/>
-              <w:left w:val="single" w:sz="1" w:color="C8D8E8"/>
-              <w:bottom w:val="single" w:sz="1" w:color="C8D8E8"/>
-              <w:right w:val="single" w:sz="1" w:color="C8D8E8"/>
-            </w:tcBorders>
-            <w:shd w:val="clear" w:color="auto" w:fill="FFFFFF"/>
-            <w:tcMar>
-              <w:top w:w="80" w:type="dxa"/>
-              <w:left w:w="120" w:type="dxa"/>
-              <w:bottom w:w="80" w:type="dxa"/>
-              <w:right w:w="120" w:type="dxa"/>
-            </w:tcMar>
-          </w:tcPr>
-          <w:p>
-            <w:r>
-              <w:rPr>
-                <w:color w:val="1A1A1A"/>
-                <w:sz w:val="17"/>
-                <w:szCs w:val="17"/>
-              </w:rPr>
-              <w:t>EU Cyber Resilience Act 2024/2847 — Art. 13 Abs. 5 (SBOM-Pflicht), Art. 14</w:t>
-            </w:r>
-          </w:p>
-        </w:tc>
-      </w:tr>
-      <w:tr>
-        <w:tc>
-          <w:tcPr>
-            <w:tcW w:w="2400" w:type="dxa"/>
-            <w:tcBorders>
-              <w:top w:val="single" w:sz="1" w:color="C8D8E8"/>
-              <w:left w:val="single" w:sz="1" w:color="C8D8E8"/>
-              <w:bottom w:val="single" w:sz="1" w:color="C8D8E8"/>
-              <w:right w:val="single" w:sz="1" w:color="C8D8E8"/>
-            </w:tcBorders>
-            <w:shd w:val="clear" w:color="auto" w:fill="F2F4F7"/>
-            <w:tcMar>
-              <w:top w:w="80" w:type="dxa"/>
-              <w:left w:w="120" w:type="dxa"/>
-              <w:bottom w:w="80" w:type="dxa"/>
-              <w:right w:w="120" w:type="dxa"/>
-            </w:tcMar>
-          </w:tcPr>
-          <w:p>
-            <w:r>
-              <w:rPr>
-                <w:b/>
-                <w:color w:val="1A1A1A"/>
-                <w:sz w:val="17"/>
-                <w:szCs w:val="17"/>
-              </w:rPr>
-              <w:t>SBOM-Format</w:t>
-            </w:r>
-          </w:p>
-        </w:tc>
-        <w:tc>
-          <w:tcPr>
-            <w:tcW w:w="6626" w:type="dxa"/>
-            <w:tcBorders>
-              <w:top w:val="single" w:sz="1" w:color="C8D8E8"/>
-              <w:left w:val="single" w:sz="1" w:color="C8D8E8"/>
-              <w:bottom w:val="single" w:sz="1" w:color="C8D8E8"/>
-              <w:right w:val="single" w:sz="1" w:color="C8D8E8"/>
-            </w:tcBorders>
-            <w:shd w:val="clear" w:color="auto" w:fill="FFFFFF"/>
-            <w:tcMar>
-              <w:top w:w="80" w:type="dxa"/>
-              <w:left w:w="120" w:type="dxa"/>
-              <w:bottom w:w="80" w:type="dxa"/>
-              <w:right w:w="120" w:type="dxa"/>
-            </w:tcMar>
-          </w:tcPr>
-          <w:p>
-            <w:r>
-              <w:rPr>
-                <w:color w:val="1A1A1A"/>
-                <w:sz w:val="17"/>
-                <w:szCs w:val="17"/>
-              </w:rPr>
-              <w:t>CycloneDX 1.6 (JSON) oder SPDX 2.3</w:t>
-            </w:r>
-          </w:p>
-        </w:tc>
-      </w:tr>
-      <w:tr>
-        <w:tc>
-          <w:tcPr>
-            <w:tcW w:w="2400" w:type="dxa"/>
-            <w:tcBorders>
-              <w:top w:val="single" w:sz="1" w:color="C8D8E8"/>
-              <w:left w:val="single" w:sz="1" w:color="C8D8E8"/>
-              <w:bottom w:val="single" w:sz="1" w:color="C8D8E8"/>
-              <w:right w:val="single" w:sz="1" w:color="C8D8E8"/>
-            </w:tcBorders>
-            <w:shd w:val="clear" w:color="auto" w:fill="F2F4F7"/>
-            <w:tcMar>
-              <w:top w:w="80" w:type="dxa"/>
-              <w:left w:w="120" w:type="dxa"/>
-              <w:bottom w:w="80" w:type="dxa"/>
-              <w:right w:w="120" w:type="dxa"/>
-            </w:tcMar>
-          </w:tcPr>
-          <w:p>
-            <w:r>
-              <w:rPr>
-                <w:b/>
-                <w:color w:val="1A1A1A"/>
-                <w:sz w:val="17"/>
-                <w:szCs w:val="17"/>
-              </w:rPr>
-              <w:t>Konformität</w:t>
-            </w:r>
-          </w:p>
-        </w:tc>
-        <w:tc>
-          <w:tcPr>
-            <w:tcW w:w="6626" w:type="dxa"/>
-            <w:tcBorders>
-              <w:top w:val="single" w:sz="1" w:color="C8D8E8"/>
-              <w:left w:val="single" w:sz="1" w:color="C8D8E8"/>
-              <w:bottom w:val="single" w:sz="1" w:color="C8D8E8"/>
-              <w:right w:val="single" w:sz="1" w:color="C8D8E8"/>
-            </w:tcBorders>
-            <w:shd w:val="clear" w:color="auto" w:fill="FFFFFF"/>
-            <w:tcMar>
-              <w:top w:w="80" w:type="dxa"/>
-              <w:left w:w="120" w:type="dxa"/>
-              <w:bottom w:w="80" w:type="dxa"/>
-              <w:right w:w="120" w:type="dxa"/>
-            </w:tcMar>
-          </w:tcPr>
-          <w:p>
-            <w:r>
-              <w:rPr>
-                <w:color w:val="1A1A1A"/>
-                <w:sz w:val="17"/>
-                <w:szCs w:val="17"/>
-              </w:rPr>
-              <w:t>Level 2 + CGFS-1 (CGFI/Manifest). Empfohlen: CGFS-3 (WORM + OAIS)</w:t>
-            </w:r>
-          </w:p>
-        </w:tc>
-      </w:tr>
-      <w:tr>
-        <w:tc>
-          <w:tcPr>
-            <w:tcW w:w="2400" w:type="dxa"/>
-            <w:tcBorders>
-              <w:top w:val="single" w:sz="1" w:color="C8D8E8"/>
-              <w:left w:val="single" w:sz="1" w:color="C8D8E8"/>
-              <w:bottom w:val="single" w:sz="1" w:color="C8D8E8"/>
-              <w:right w:val="single" w:sz="1" w:color="C8D8E8"/>
-            </w:tcBorders>
-            <w:shd w:val="clear" w:color="auto" w:fill="F2F4F7"/>
-            <w:tcMar>
-              <w:top w:w="80" w:type="dxa"/>
-              <w:left w:w="120" w:type="dxa"/>
-              <w:bottom w:w="80" w:type="dxa"/>
-              <w:right w:w="120" w:type="dxa"/>
-            </w:tcMar>
-          </w:tcPr>
-          <w:p>
-            <w:r>
-              <w:rPr>
-                <w:b/>
-                <w:color w:val="1A1A1A"/>
-                <w:sz w:val="17"/>
-                <w:szCs w:val="17"/>
-              </w:rPr>
-              <w:t>Trigger</w:t>
-            </w:r>
-          </w:p>
-        </w:tc>
-        <w:tc>
-          <w:tcPr>
-            <w:tcW w:w="6626" w:type="dxa"/>
-            <w:tcBorders>
-              <w:top w:val="single" w:sz="1" w:color="C8D8E8"/>
-              <w:left w:val="single" w:sz="1" w:color="C8D8E8"/>
-              <w:bottom w:val="single" w:sz="1" w:color="C8D8E8"/>
-              <w:right w:val="single" w:sz="1" w:color="C8D8E8"/>
-            </w:tcBorders>
-            <w:shd w:val="clear" w:color="auto" w:fill="FFFFFF"/>
-            <w:tcMar>
-              <w:top w:w="80" w:type="dxa"/>
-              <w:left w:w="120" w:type="dxa"/>
-              <w:bottom w:w="80" w:type="dxa"/>
-              <w:right w:w="120" w:type="dxa"/>
-            </w:tcMar>
-          </w:tcPr>
-          <w:p>
-            <w:r>
-              <w:rPr>
-                <w:color w:val="1A1A1A"/>
-                <w:sz w:val="17"/>
-                <w:szCs w:val="17"/>
-              </w:rPr>
-              <w:t>Build-Artefakt fertig — SBOM wird generiert</w:t>
-            </w:r>
-          </w:p>
-        </w:tc>
-      </w:tr>
-      <w:tr>
-        <w:tc>
-          <w:tcPr>
-            <w:tcW w:w="2400" w:type="dxa"/>
-            <w:tcBorders>
-              <w:top w:val="single" w:sz="1" w:color="C8D8E8"/>
-              <w:left w:val="single" w:sz="1" w:color="C8D8E8"/>
-              <w:bottom w:val="single" w:sz="1" w:color="C8D8E8"/>
-              <w:right w:val="single" w:sz="1" w:color="C8D8E8"/>
-            </w:tcBorders>
-            <w:shd w:val="clear" w:color="auto" w:fill="F2F4F7"/>
-            <w:tcMar>
-              <w:top w:w="80" w:type="dxa"/>
-              <w:left w:w="120" w:type="dxa"/>
-              <w:bottom w:w="80" w:type="dxa"/>
-              <w:right w:w="120" w:type="dxa"/>
-            </w:tcMar>
-          </w:tcPr>
-          <w:p>
-            <w:r>
-              <w:rPr>
-                <w:b/>
-                <w:color w:val="1A1A1A"/>
-                <w:sz w:val="17"/>
-                <w:szCs w:val="17"/>
-              </w:rPr>
-              <w:t>Referenz</w:t>
-            </w:r>
-          </w:p>
-        </w:tc>
-        <w:tc>
-          <w:tcPr>
-            <w:tcW w:w="6626" w:type="dxa"/>
-            <w:tcBorders>
-              <w:top w:val="single" w:sz="1" w:color="C8D8E8"/>
-              <w:left w:val="single" w:sz="1" w:color="C8D8E8"/>
-              <w:bottom w:val="single" w:sz="1" w:color="C8D8E8"/>
-              <w:right w:val="single" w:sz="1" w:color="C8D8E8"/>
-            </w:tcBorders>
-            <w:shd w:val="clear" w:color="auto" w:fill="FFFFFF"/>
-            <w:tcMar>
-              <w:top w:w="80" w:type="dxa"/>
-              <w:left w:w="120" w:type="dxa"/>
-              <w:bottom w:w="80" w:type="dxa"/>
-              <w:right w:w="120" w:type="dxa"/>
-            </w:tcMar>
-          </w:tcPr>
-          <w:p>
-            <w:r>
-              <w:rPr>
-                <w:color w:val="1A1A1A"/>
-                <w:sz w:val="17"/>
-                <w:szCs w:val="17"/>
-              </w:rPr>
-              <w:t>Detailliertes Anwendungsprofil: CG-APP-0910 „CRA/SBOM Timestamp Profile“</w:t>
-            </w:r>
-          </w:p>
-        </w:tc>
-      </w:tr>
-    </w:tbl>
-    <w:p>
-      <w:pPr>
-        <w:spacing w:after="80"/>
-      </w:pPr>
-    </w:p>
-    <w:p>
-      <w:pPr>
-        <w:pStyle w:val="Heading3"/>
-      </w:pPr>
-      <w:r>
-        <w:rPr>
-          <w:b/>
-          <w:color w:val="1B3A6B"/>
-          <w:sz w:val="19"/>
-          <w:szCs w:val="19"/>
-        </w:rPr>
-        <w:t>7.1  Problem</w:t>
-      </w:r>
-    </w:p>
-    <w:p>
-      <w:pPr>
-        <w:spacing w:after="120" w:line="276"/>
-      </w:pPr>
-      <w:r>
-        <w:rPr>
-          <w:color w:val="1A1A1A"/>
-          <w:sz w:val="18"/>
-          <w:szCs w:val="18"/>
-        </w:rPr>
-        <w:t xml:space="preserve">CycloneDX/SPDX verwenden ISO 8601 als editierbares Textfeld ohne kryptographische Verankerung. Für CRA Art. 13 Abs. 5 ist das strukturell unzureichend. </w:t>
-      </w:r>
-      <w:r>
-        <w:rPr>
-          <w:b/>
-          <w:bCs/>
-          <w:color w:val="1A1A1A"/>
-          <w:sz w:val="18"/>
-          <w:szCs w:val="18"/>
-        </w:rPr>
-        <w:t xml:space="preserve">CGFI</w:t>
-      </w:r>
-      <w:r>
-        <w:rPr>
-          <w:color w:val="1A1A1A"/>
-          <w:sz w:val="18"/>
-          <w:szCs w:val="18"/>
-        </w:rPr>
-        <w:t xml:space="preserve"> löst das: der TAI-Zeitpunkt ist Teil des Hash-Inputs — Manipulation bricht den CGFI sofort.</w:t>
-      </w:r>
-    </w:p>
-    <w:p>
-      <w:pPr>
-        <w:spacing w:after="80"/>
-      </w:pPr>
-    </w:p>
-    <w:p>
-      <w:pPr>
-        <w:pStyle w:val="Heading3"/>
-      </w:pPr>
-      <w:r>
-        <w:rPr>
-          <w:b/>
-          <w:color w:val="1B3A6B"/>
-          <w:sz w:val="19"/>
-          <w:szCs w:val="19"/>
-        </w:rPr>
-        <w:t>7.2  Ablauf</w:t>
-      </w:r>
-    </w:p>
-    <w:p>
-      <w:pPr>
-        <w:spacing w:after="80"/>
-        <w:ind w:left="360" w:hanging="180"/>
-      </w:pPr>
-      <w:r>
-        <w:rPr>
-          <w:color w:val="1A1A1A"/>
-          <w:sz w:val="18"/>
-          <w:szCs w:val="18"/>
-        </w:rPr>
-        <w:t xml:space="preserve">•  CI/CD baut Artefakt und generiert SBOM (z. B. via Syft als CycloneDX 1.6 JSON).</w:t>
-      </w:r>
-    </w:p>
-    <w:p>
-      <w:pPr>
-        <w:spacing w:after="80"/>
-        <w:ind w:left="360" w:hanging="180"/>
-      </w:pPr>
-      <w:r>
-        <w:rPr>
-          <w:color w:val="1A1A1A"/>
-          <w:sz w:val="18"/>
-          <w:szCs w:val="18"/>
-        </w:rPr>
-        <w:t xml:space="preserve">•  CGFI = SHA-256(TAI-Zeitpunkt ‖ SHA-256(sbom.json) ‖ urn:cgns:filetype:sbom-cyclonedx:v1).</w:t>
-      </w:r>
-    </w:p>
-    <w:p>
-      <w:pPr>
-        <w:spacing w:after="80"/>
-        <w:ind w:left="360" w:hanging="180"/>
-      </w:pPr>
-      <w:r>
-        <w:rPr>
-          <w:color w:val="1A1A1A"/>
-          <w:sz w:val="18"/>
-          <w:szCs w:val="18"/>
-        </w:rPr>
-        <w:t xml:space="preserve">•  CGFI + CGTA als externalReference in SBOM eingetragen — kein Umbau des SBOM-Formats.</w:t>
-      </w:r>
-    </w:p>
-    <w:p>
-      <w:pPr>
-        <w:spacing w:after="80"/>
-        <w:ind w:left="360" w:hanging="180"/>
-      </w:pPr>
-      <w:r>
-        <w:rPr>
-          <w:color w:val="1A1A1A"/>
-          <w:sz w:val="18"/>
-          <w:szCs w:val="18"/>
-        </w:rPr>
-        <w:t xml:space="preserve">•  CRA-Prüfung: Auditor rechnet CGFI selbst nach — kein Systemzugang nötig.</w:t>
-      </w:r>
-    </w:p>
-    <w:p>
-      <w:pPr>
-        <w:spacing w:after="80"/>
-        <w:ind w:left="360" w:hanging="180"/>
-      </w:pPr>
-      <w:r>
-        <w:rPr>
-          <w:color w:val="1A1A1A"/>
-          <w:sz w:val="18"/>
-          <w:szCs w:val="18"/>
-        </w:rPr>
-        <w:t xml:space="preserve">•  Vulnerability Disclosure Art. 14: CGFI-Sequenz (Notif-CGFI → Patch-SBOM-CGFI) beweist Reaktionszeit in TAI.</w:t>
-      </w:r>
-    </w:p>
-    <w:p>
-      <w:pPr>
-        <w:spacing w:after="80"/>
-      </w:pPr>
-    </w:p>
-    <w:p>
-      <w:pPr>
-        <w:pStyle w:val="Heading3"/>
-      </w:pPr>
-      <w:r>
-        <w:rPr>
-          <w:b/>
-          <w:color w:val="1B3A6B"/>
-          <w:sz w:val="19"/>
-          <w:szCs w:val="19"/>
-        </w:rPr>
-        <w:t>7.3  GitHub Action (PoC)</w:t>
-      </w:r>
-    </w:p>
-    <w:tbl>
-      <w:tblPr>
-        <w:tblW w:w="9026" w:type="dxa"/>
-      </w:tblPr>
-      <w:tblGrid>
-        <w:gridCol w:w="9026"/>
-      </w:tblGrid>
-      <w:tr>
-        <w:tc>
-          <w:tcPr>
-            <w:tcW w:w="9026" w:type="dxa"/>
-            <w:tcBorders>
-              <w:top w:val="single" w:sz="4" w:color="2C3E50"/>
-              <w:left w:val="single" w:sz="4" w:color="2C3E50"/>
-              <w:bottom w:val="single" w:sz="4" w:color="2C3E50"/>
-              <w:right w:val="single" w:sz="4" w:color="2C3E50"/>
-            </w:tcBorders>
-            <w:shd w:val="clear" w:color="auto" w:fill="F8F9FA"/>
-            <w:tcMar>
-              <w:top w:w="120" w:type="dxa"/>
-              <w:left w:w="180" w:type="dxa"/>
-              <w:bottom w:w="120" w:type="dxa"/>
-              <w:right w:w="180" w:type="dxa"/>
-            </w:tcMar>
-          </w:tcPr>
-          <w:p>
-            <w:pPr>
-              <w:spacing w:after="40"/>
-            </w:pPr>
-            <w:r>
-              <w:rPr>
-                <w:rFonts w:ascii="Courier New" w:hAnsi="Courier New"/>
-                <w:color w:val="2C3E50"/>
-                <w:sz w:val="16"/>
-                <w:szCs w:val="16"/>
-              </w:rPr>
-              <w:t xml:space="preserve"># .github/workflows/sbom-timestamp.yml</w:t>
-            </w:r>
-          </w:p>
-          <w:p>
-            <w:pPr>
-              <w:spacing w:after="40"/>
-            </w:pPr>
-            <w:r>
-              <w:rPr>
-                <w:rFonts w:ascii="Courier New" w:hAnsi="Courier New"/>
-                <w:color w:val="2C3E50"/>
-                <w:sz w:val="16"/>
-                <w:szCs w:val="16"/>
-              </w:rPr>
-              <w:t xml:space="preserve">- name: Generate SBOM</w:t>
-            </w:r>
-          </w:p>
-          <w:p>
-            <w:pPr>
-              <w:spacing w:after="40"/>
-            </w:pPr>
-            <w:r>
-              <w:rPr>
-                <w:rFonts w:ascii="Courier New" w:hAnsi="Courier New"/>
-                <w:color w:val="2C3E50"/>
-                <w:sz w:val="16"/>
-                <w:szCs w:val="16"/>
-              </w:rPr>
-              <w:t xml:space="preserve">  run: syft packages . -o cyclonedx-json &gt; sbom.json</w:t>
-            </w:r>
-          </w:p>
-          <w:p>
-            <w:pPr>
-              <w:spacing w:after="40"/>
-            </w:pPr>
-            <w:r>
-              <w:rPr>
-                <w:rFonts w:ascii="Courier New" w:hAnsi="Courier New"/>
-                <w:color w:val="2C3E50"/>
-                <w:sz w:val="16"/>
-                <w:szCs w:val="16"/>
-              </w:rPr>
-              <w:t xml:space="preserve"/>
-            </w:r>
-          </w:p>
-          <w:p>
-            <w:pPr>
-              <w:spacing w:after="40"/>
-            </w:pPr>
-            <w:r>
-              <w:rPr>
-                <w:rFonts w:ascii="Courier New" w:hAnsi="Courier New"/>
-                <w:color w:val="2C3E50"/>
-                <w:sz w:val="16"/>
-                <w:szCs w:val="16"/>
-              </w:rPr>
-              <w:t xml:space="preserve">- name: ChronoGrid CGFI Timestamp</w:t>
-            </w:r>
-          </w:p>
-          <w:p>
-            <w:pPr>
-              <w:spacing w:after="40"/>
-            </w:pPr>
-            <w:r>
-              <w:rPr>
-                <w:rFonts w:ascii="Courier New" w:hAnsi="Courier New"/>
-                <w:color w:val="2C3E50"/>
-                <w:sz w:val="16"/>
-                <w:szCs w:val="16"/>
-              </w:rPr>
-              <w:t xml:space="preserve">  run: |</w:t>
-            </w:r>
-          </w:p>
-          <w:p>
-            <w:pPr>
-              <w:spacing w:after="40"/>
-            </w:pPr>
-            <w:r>
-              <w:rPr>
-                <w:rFonts w:ascii="Courier New" w:hAnsi="Courier New"/>
-                <w:color w:val="2C3E50"/>
-                <w:sz w:val="16"/>
-                <w:szCs w:val="16"/>
-              </w:rPr>
-              <w:t xml:space="preserve">    CONTENT_HASH=</w:t>
-            </w:r>
-          </w:p>
-          <w:p>
-            <w:pPr>
-              <w:spacing w:after="40"/>
-            </w:pPr>
-            <w:r>
-              <w:rPr>
-                <w:rFonts w:ascii="Courier New" w:hAnsi="Courier New"/>
-                <w:color w:val="2C3E50"/>
-                <w:sz w:val="16"/>
-                <w:szCs w:val="16"/>
-              </w:rPr>
-              <w:t xml:space="preserve">    CGFI=</w:t>
-            </w:r>
-          </w:p>
-          <w:p>
-            <w:pPr>
-              <w:spacing w:after="40"/>
-            </w:pPr>
-            <w:r>
-              <w:rPr>
-                <w:rFonts w:ascii="Courier New" w:hAnsi="Courier New"/>
-                <w:color w:val="2C3E50"/>
-                <w:sz w:val="16"/>
-                <w:szCs w:val="16"/>
-              </w:rPr>
-              <w:t xml:space="preserve"/>
-            </w:r>
-          </w:p>
-          <w:p>
-            <w:pPr>
-              <w:spacing w:after="40"/>
-            </w:pPr>
-            <w:r>
-              <w:rPr>
-                <w:rFonts w:ascii="Courier New" w:hAnsi="Courier New"/>
-                <w:color w:val="2C3E50"/>
-                <w:sz w:val="16"/>
-                <w:szCs w:val="16"/>
-              </w:rPr>
-              <w:t xml:space="preserve">- name: Embed CGFI in SBOM</w:t>
-            </w:r>
-          </w:p>
-          <w:p>
-            <w:pPr>
-              <w:spacing w:after="40"/>
-            </w:pPr>
-            <w:r>
-              <w:rPr>
-                <w:rFonts w:ascii="Courier New" w:hAnsi="Courier New"/>
-                <w:color w:val="2C3E50"/>
-                <w:sz w:val="16"/>
-                <w:szCs w:val="16"/>
-              </w:rPr>
-              <w:t xml:space="preserve">  run: |</w:t>
-            </w:r>
-          </w:p>
-          <w:p>
-            <w:pPr>
-              <w:spacing w:after="40"/>
-            </w:pPr>
-            <w:r>
-              <w:rPr>
-                <w:rFonts w:ascii="Courier New" w:hAnsi="Courier New"/>
-                <w:color w:val="2C3E50"/>
-                <w:sz w:val="16"/>
-                <w:szCs w:val="16"/>
-              </w:rPr>
-              <w:t xml:space="preserve">    jq --arg cgfi "" \</w:t>
-            </w:r>
-          </w:p>
-          <w:p>
-            <w:pPr>
-              <w:spacing w:after="40"/>
-            </w:pPr>
-            <w:r>
-              <w:rPr>
-                <w:rFonts w:ascii="Courier New" w:hAnsi="Courier New"/>
-                <w:color w:val="2C3E50"/>
-                <w:sz w:val="16"/>
-                <w:szCs w:val="16"/>
-              </w:rPr>
-              <w:t xml:space="preserve">      '.externalReferences += [{"type":"other","url":"cgfi://"+\}]' \</w:t>
-            </w:r>
-          </w:p>
-          <w:p>
-            <w:pPr>
-              <w:spacing w:after="40"/>
-            </w:pPr>
-            <w:r>
-              <w:rPr>
-                <w:rFonts w:ascii="Courier New" w:hAnsi="Courier New"/>
-                <w:color w:val="2C3E50"/>
-                <w:sz w:val="16"/>
-                <w:szCs w:val="16"/>
-              </w:rPr>
-              <w:t xml:space="preserve">      sbom.json &gt; sbom-timestamped.json</w:t>
-            </w:r>
-          </w:p>
-        </w:tc>
-      </w:tr>
-    </w:tbl>
-    <w:p>
-      <w:pPr>
-        <w:spacing w:after="80"/>
-      </w:pPr>
-    </w:p>
     <w:sectPr>
       <w:headerReference w:type="default" r:id="rId7"/>
       <w:footerReference w:type="default" r:id="rId8"/>

</xml_diff>